<commit_message>
Fix ENGL1102 Unit 6 assignment: correct BLS sleep citation, update BLS URL to charts page
</commit_message>
<xml_diff>
--- a/ENGL1102_English_Composition_2/Unit6_Writing_Reports/Assignment/Unit6_Written_Assignment.docx
+++ b/ENGL1102_English_Composition_2/Unit6_Writing_Reports/Assignment/Unit6_Written_Assignment.docx
@@ -215,7 +215,7 @@
           <w:rFonts w:ascii="Times New Roman" w:hAnsi="Times New Roman"/>
           <w:sz w:val="24"/>
         </w:rPr>
-        <w:t xml:space="preserve">The pie chart reveals that sleeping constitutes the single largest share of Americans’ daily time, accounting for approximately 8.8 hours per day — roughly 37% of a 24-hour period (U.S. Bureau of Labor Statistics, 2024). This finding is consistent with medical recommendations that adults require between seven and nine hours of sleep per night for optimal health (U.S. Bureau of Labor Statistics, 2024).</w:t>
+        <w:t xml:space="preserve">The pie chart reveals that sleeping constitutes the single largest share of Americans’ daily time, accounting for approximately 8.8 hours per day — roughly 37% of a 24-hour period (U.S. Bureau of Labor Statistics, 2024). This finding aligns with the widely recognized recommendation that adults require between seven and nine hours of sleep per night for optimal cognitive and physical health (U.S. Bureau of Labor Statistics, 2024).</w:t>
       </w:r>
     </w:p>
     <w:p>
@@ -475,14 +475,21 @@
           <w:iCs/>
           <w:sz w:val="24"/>
         </w:rPr>
-        <w:t xml:space="preserve">American time use survey</w:t>
-      </w:r>
-      <w:r>
-        <w:rPr>
-          <w:rFonts w:ascii="Times New Roman" w:hAnsi="Times New Roman"/>
-          <w:sz w:val="24"/>
-        </w:rPr>
-        <w:t xml:space="preserve">. https://www.bls.gov/tus/</w:t>
+        <w:t xml:space="preserve">American time use survey — charts by topic: How do you spend your time?</w:t>
+      </w:r>
+      <w:r>
+        <w:rPr>
+          <w:rFonts w:ascii="Times New Roman" w:hAnsi="Times New Roman"/>
+          <w:sz w:val="24"/>
+        </w:rPr>
+        <w:t xml:space="preserve"> </w:t>
+      </w:r>
+      <w:r>
+        <w:rPr>
+          <w:rFonts w:ascii="Times New Roman" w:hAnsi="Times New Roman"/>
+          <w:sz w:val="24"/>
+        </w:rPr>
+        <w:t xml:space="preserve">https://www.bls.gov/tus/charts/</w:t>
       </w:r>
     </w:p>
     <w:p>
@@ -518,7 +525,7 @@
           <w:rFonts w:ascii="Times New Roman" w:hAnsi="Times New Roman"/>
           <w:sz w:val="24"/>
         </w:rPr>
-        <w:t xml:space="preserve">: ~620 words (body, excluding title and references)</w:t>
+        <w:t xml:space="preserve">: ~609 words (body, excluding title and references)</w:t>
       </w:r>
     </w:p>
     <w:bookmarkEnd w:id="13"/>

</xml_diff>